<commit_message>
Align Wilken messages with the company website
Use the website's wording for the 30+ years of experience, add the
website's industries, products and a customer quote, and flag the
founding year for the client to confirm.

Co-Authored-By: Claude Opus 5.5 <noreply@anthropic.com>
Claude-Session: https://claude.ai/code/session_018AsKRCDgw5Ln2FqTPH9DBq
</commit_message>
<xml_diff>
--- a/Outreach Messages - Wilken Enterprises.docx
+++ b/Outreach Messages - Wilken Enterprises.docx
@@ -65,7 +65,7 @@
     <w:p>
       <w:r>
         <w:rPr/>
-        <w:t xml:space="preserve">Wilken Enterprises is a filtration supplier based in Lafayette, Indiana, that has been solving filtration problems for over 30 years. The promise is simple: one trusted source for all filtration and absorbent needs, with competitive pricing, expert service and reliable delivery.</w:t>
+        <w:t xml:space="preserve">Wilken Enterprises is a filtration supplier based in Lafayette, Indiana, and a single source for all filtration and absorbent needs, with competitive pricing, expert service and reliable delivery. The team brings over 30 years of manufacturing and filtration experience, including hands-on work with programs such as ISO, 5S, TQM, JIT and Kanban. They don't just sell filters: they work with customers to solve problems, and focus on customers who care about value more than the lowest price.</w:t>
       </w:r>
     </w:p>
     <w:p>
@@ -77,7 +77,7 @@
     <w:p>
       <w:r>
         <w:rPr/>
-        <w:t xml:space="preserve">Wilken works across healthcare, data centers, food and beverage processing, general and automotive manufacturing, chemical processing, commercial facilities and aerospace.</w:t>
+        <w:t xml:space="preserve">The website also lists paint and finishing products, and roll goods and filter press media. Between the website and the brochure, Wilken works across general and automotive manufacturing, automotive finishing, chemical processing, food and beverage processing, pharmaceutical, healthcare, bio energy and power generation, commercial buildings, schools and universities, data centers and aerospace. Customers on the website say Wilken works with them “in a partnership atmosphere” and “makes our filters easier to buy”.</w:t>
       </w:r>
     </w:p>
     <w:p>
@@ -509,7 +509,7 @@
       </w:r>
       <w:r>
         <w:rPr/>
-        <w:t xml:space="preserve"> the brochure lists general manufacturing, automotive manufacturing and chemical processing among the industries Wilken already serves.</w:t>
+        <w:t xml:space="preserve"> the website and brochure list general manufacturing, automotive manufacturing and finishing, and chemical processing among the industries Wilken already serves.</w:t>
       </w:r>
     </w:p>
     <w:p>
@@ -1459,7 +1459,7 @@
     <w:p>
       <w:r>
         <w:rPr/>
-        <w:t xml:space="preserve">This follow-up is an entirely different approach. If the previous conversation starters didn't resonate, we assume we need a credibility boost. Wilken's credibility comes from over 30 years in filtration, the industries it already serves, and the full range under one roof.</w:t>
+        <w:t xml:space="preserve">This follow-up is an entirely different approach. If the previous conversation starters didn't resonate, we assume we need a credibility boost. Wilken's credibility comes from over 30 years of manufacturing and filtration experience, the industries it already serves, what its customers say, and the full range under one roof.</w:t>
       </w:r>
     </w:p>
     <w:p>
@@ -1509,7 +1509,7 @@
           <w:i w:val="1"/>
           <w:iCs w:val="1"/>
         </w:rPr>
-        <w:t xml:space="preserve">, I jumped into questions without properly introducing myself. I'm Matt from Wilken Enterprises in Lafayette. We've been solving filtration problems for over 30 years, for automotive, chemical processing and general manufacturing companies, among others. We supply dust collection, HVAC, liquid, hydraulic and compressed air filters, plus absorbents and spill control, so a plant can get all of it from one place. If interested, happy to tell you more.</w:t>
+        <w:t xml:space="preserve">, I jumped into questions without properly introducing myself. I'm Matt from Wilken Enterprises in Lafayette. We bring over 30 years of manufacturing and filtration experience, and work with automotive, chemical processing and general manufacturing companies, among others. We supply dust collection, HVAC, liquid, hydraulic and compressed air filters, plus absorbents and spill control, all from one place. One customer put it simply: we make their filters easier to buy. If interested, happy to tell you more.</w:t>
       </w:r>
     </w:p>
     <w:p>
@@ -1559,7 +1559,7 @@
           <w:i w:val="1"/>
           <w:iCs w:val="1"/>
         </w:rPr>
-        <w:t xml:space="preserve">, I should have introduced myself properly. I'm Matt from Wilken Enterprises, a filter supplier in Lafayette with over 30 years in filtration. Simply put, we'd like to be the one place </w:t>
+        <w:t xml:space="preserve">, I should have introduced myself properly. I'm Matt from Wilken Enterprises, a filter supplier in Lafayette with over 30 years of manufacturing and filtration experience. Simply put, we'd like to be the one place </w:t>
       </w:r>
       <w:r>
         <w:rPr>
@@ -1809,7 +1809,7 @@
           <w:i w:val="1"/>
           <w:iCs w:val="1"/>
         </w:rPr>
-        <w:t xml:space="preserve">I'm Matt from Wilken Enterprises, a filtration supplier in Lafayette, Indiana. We've been solving filtration problems for over 30 years.</w:t>
+        <w:t xml:space="preserve">I'm Matt from Wilken Enterprises, a filtration supplier in Lafayette, Indiana. We bring over 30 years of manufacturing and filtration experience.</w:t>
       </w:r>
     </w:p>
     <w:p>
@@ -2395,11 +2395,11 @@
           <w:b w:val="1"/>
           <w:bCs w:val="1"/>
         </w:rPr>
-        <w:t xml:space="preserve">No client names or numbers yet:</w:t>
-      </w:r>
-      <w:r>
-        <w:rPr/>
-        <w:t xml:space="preserve"> the credibility message uses only facts from the brochure (over 30 years, the industries served, the product range). If Wilken can share one or two customer examples, with permission, they would make the credibility message much stronger.</w:t>
+        <w:t xml:space="preserve">Credibility:</w:t>
+      </w:r>
+      <w:r>
+        <w:rPr/>
+        <w:t xml:space="preserve"> the credibility message uses facts from the website and brochure (over 30 years of experience, the industries served, the product range) and one line from a customer quote on the website. If Wilken can share one or two named customer examples, with permission, they would make it stronger.</w:t>
       </w:r>
     </w:p>
     <w:p>
@@ -2442,6 +2442,48 @@
       <w:r>
         <w:rPr/>
         <w:t xml:space="preserve"> the 51-1,000 employee range is our suggestion. We can widen it if the first searches return too few leads in Indiana.</w:t>
+      </w:r>
+    </w:p>
+    <w:p>
+      <w:pPr>
+        <w:numPr>
+          <w:ilvl w:val="0"/>
+          <w:numId w:val="2"/>
+        </w:numPr>
+        <w:spacing w:after="0" w:before="120" w:lineRule="auto"/>
+        <w:ind w:left="720" w:hanging="360"/>
+      </w:pPr>
+      <w:r>
+        <w:rPr>
+          <w:b w:val="1"/>
+          <w:bCs w:val="1"/>
+        </w:rPr>
+        <w:t xml:space="preserve">Over 30 years:</w:t>
+      </w:r>
+      <w:r>
+        <w:rPr/>
+        <w:t xml:space="preserve"> the brochure says “solving filtration problems for over 30 years”, while the website says the team brings over 30 years of manufacturing and filtration experience, and one search result says the company was founded in 2013. The messages use the website wording, which is true either way. Please confirm with Kaity.</w:t>
+      </w:r>
+    </w:p>
+    <w:p>
+      <w:pPr>
+        <w:numPr>
+          <w:ilvl w:val="0"/>
+          <w:numId w:val="2"/>
+        </w:numPr>
+        <w:spacing w:after="0" w:before="120" w:lineRule="auto"/>
+        <w:ind w:left="720" w:hanging="360"/>
+      </w:pPr>
+      <w:r>
+        <w:rPr>
+          <w:b w:val="1"/>
+          <w:bCs w:val="1"/>
+        </w:rPr>
+        <w:t xml:space="preserve">Tim and Matt:</w:t>
+      </w:r>
+      <w:r>
+        <w:rPr/>
+        <w:t xml:space="preserve"> the website testimonials mention Tim by name. The messages are sent from Matt's profile, so they don't name Tim.</w:t>
       </w:r>
     </w:p>
     <w:p>
@@ -2510,6 +2552,10 @@
           <w:t xml:space="preserve">https://wilkenenterprises.com/</w:t>
         </w:r>
       </w:hyperlink>
+      <w:r>
+        <w:rPr/>
+        <w:t xml:space="preserve"> (Home, About, Products, Industries, Services)</w:t>
+      </w:r>
     </w:p>
     <w:p>
       <w:pPr>

</xml_diff>

<commit_message>
Describe Wilken as acquired by Steiner and how Steiner comes in
Co-Authored-By: Claude Opus 5.5 <noreply@anthropic.com>
Claude-Session: https://claude.ai/code/session_018AsKRCDgw5Ln2FqTPH9DBq
</commit_message>
<xml_diff>
--- a/Outreach Messages - Wilken Enterprises.docx
+++ b/Outreach Messages - Wilken Enterprises.docx
@@ -83,13 +83,91 @@
     <w:p>
       <w:r>
         <w:rPr/>
-        <w:t xml:space="preserve">Steiner Enterprises shares the same Lafayette address. It is a contract manufacturer: engineering and design, prototypes, injection molding, precision machining, sheet metal fabrication, assembly and 3D printing, with onshore, nearshore and offshore production. Wilken customers already ask “can you help us with this too?” about products that aren't filters, and that's the way in for Steiner. So we start with Wilken, and Steiner comes in through those conversations.</w:t>
-      </w:r>
-    </w:p>
-    <w:p>
-      <w:r>
-        <w:rPr/>
-        <w:t xml:space="preserve">For the outreach campaign, we focus on the one-source offer: all the filters and absorbents a plant uses, from one supplier close by. The opening offer is a free quote on the filters they already buy, not a contract.</w:t>
+        <w:t xml:space="preserve">Wilken was acquired by Steiner Enterprises, and both companies work from the same Lafayette address. Steiner is a contract manufacturer: engineering and design, prototypes, injection molding, precision machining, sheet metal fabrication, assembly and 3D printing, with onshore, nearshore and offshore production.</w:t>
+      </w:r>
+    </w:p>
+    <w:p>
+      <w:r>
+        <w:rPr/>
+        <w:t xml:space="preserve">Wilken is the way in for Steiner. By reliably supplying filters and absorbents, Wilken has already had many customers ask “can you help us with this too?” about products that have nothing to do with filters. Filters are an easy first yes: a small, regular order that doesn't need a long approval. Each one gives Steiner a supplier relationship with a plant that also buys parts.</w:t>
+      </w:r>
+    </w:p>
+    <w:p>
+      <w:r>
+        <w:rPr/>
+        <w:t xml:space="preserve">For the outreach campaign, we focus on Wilken's one-source offer: all the filters and absorbents a plant uses, from one supplier close by. The opening offer is a free quote on the filters they already buy, not a contract. Steiner comes in once the plant knows and trusts Wilken.</w:t>
+      </w:r>
+    </w:p>
+    <w:p>
+      <w:pPr>
+        <w:pStyle w:val="Heading3"/>
+      </w:pPr>
+      <w:r>
+        <w:rPr/>
+        <w:t xml:space="preserve">How Steiner comes in</w:t>
+      </w:r>
+    </w:p>
+    <w:p>
+      <w:pPr>
+        <w:numPr>
+          <w:ilvl w:val="0"/>
+          <w:numId w:val="2"/>
+        </w:numPr>
+        <w:spacing w:after="0" w:before="120" w:lineRule="auto"/>
+        <w:ind w:left="720" w:hanging="360"/>
+      </w:pPr>
+      <w:r>
+        <w:rPr>
+          <w:b w:val="1"/>
+          <w:bCs w:val="1"/>
+        </w:rPr>
+        <w:t xml:space="preserve">During the outreach:</w:t>
+      </w:r>
+      <w:r>
+        <w:rPr/>
+        <w:t xml:space="preserve"> if a prospect asks about anything that isn't a filter, we say Wilken is part of Steiner Enterprises and pass the conversation to the Steiner team.</w:t>
+      </w:r>
+    </w:p>
+    <w:p>
+      <w:pPr>
+        <w:numPr>
+          <w:ilvl w:val="0"/>
+          <w:numId w:val="2"/>
+        </w:numPr>
+        <w:spacing w:after="0" w:before="120" w:lineRule="auto"/>
+        <w:ind w:left="720" w:hanging="360"/>
+      </w:pPr>
+      <w:r>
+        <w:rPr>
+          <w:b w:val="1"/>
+          <w:bCs w:val="1"/>
+        </w:rPr>
+        <w:t xml:space="preserve">After the first orders:</w:t>
+      </w:r>
+      <w:r>
+        <w:rPr/>
+        <w:t xml:space="preserve"> once a plant buys from Wilken, the team mentions Steiner on a call or visit, for example “we're part of Steiner, so if you ever need machined, molded or assembled parts, we can help there too.”</w:t>
+      </w:r>
+    </w:p>
+    <w:p>
+      <w:pPr>
+        <w:numPr>
+          <w:ilvl w:val="0"/>
+          <w:numId w:val="2"/>
+        </w:numPr>
+        <w:spacing w:after="0" w:before="120" w:lineRule="auto"/>
+        <w:ind w:left="720" w:hanging="360"/>
+      </w:pPr>
+      <w:r>
+        <w:rPr>
+          <w:b w:val="1"/>
+          <w:bCs w:val="1"/>
+        </w:rPr>
+        <w:t xml:space="preserve">Later:</w:t>
+      </w:r>
+      <w:r>
+        <w:rPr/>
+        <w:t xml:space="preserve"> once we know which Wilken customers asked about Steiner, and why, we use that to plan a separate Steiner campaign.</w:t>
       </w:r>
     </w:p>
     <w:p>
@@ -1591,7 +1669,7 @@
           <w:sz w:val="22"/>
           <w:szCs w:val="22"/>
         </w:rPr>
-        <w:t xml:space="preserve">Response suggestion: if they want to know more, explain it in two or three short lines and suggest a short call. If they ask about something that isn't a filter, like machined, molded or assembled parts, say we have a sister company for that and pass it to Steiner. That's the way in for Steiner.</w:t>
+        <w:t xml:space="preserve">Response suggestion: if they want to know more, explain it in two or three short lines and suggest a short call. If they ask about something that isn't a filter, like machined, molded or assembled parts, say Wilken is part of Steiner Enterprises, which makes those, and pass the conversation to the Steiner team.</w:t>
       </w:r>
     </w:p>
     <w:p>
@@ -2420,7 +2498,7 @@
       </w:r>
       <w:r>
         <w:rPr/>
-        <w:t xml:space="preserve"> it isn't pitched in the cold messages. Any request for non-filter parts goes to the Steiner team. Once we see which plants ask, we can plan a separate Steiner campaign.</w:t>
+        <w:t xml:space="preserve"> the cold messages stay on filters, so the first ask is small and easy to say yes to. Steiner is mentioned when a prospect asks about other products, and by the team once a plant is a Wilken customer (see How Steiner comes in).</w:t>
       </w:r>
     </w:p>
     <w:p>
@@ -2506,7 +2584,7 @@
       </w:pPr>
       <w:r>
         <w:rPr/>
-        <w:t xml:space="preserve">Information from Kaity – Wilken (product types, job titles, industries, Indiana-first approach, Steiner as the next step), Steiner and Wilken – 2026 folder on Drive.</w:t>
+        <w:t xml:space="preserve">Information from Kaity – Wilken (product types, job titles, industries, Indiana-first approach, Wilken as the way in for Steiner), Steiner and Wilken – 2026 folder on Drive.</w:t>
       </w:r>
     </w:p>
     <w:p>

</xml_diff>

<commit_message>
Match the Wilken document to the brochure and Kaity's brief
Add the missing product types (oil, water and process filtration,
diffusion and exhaust media), use the brochure wording for spill kits,
and reflect Kaity's notes on HVAC filters and starting with one industry.

Co-Authored-By: Claude Opus 5.5 <noreply@anthropic.com>
Claude-Session: https://claude.ai/code/session_018AsKRCDgw5Ln2FqTPH9DBq
</commit_message>
<xml_diff>
--- a/Outreach Messages - Wilken Enterprises.docx
+++ b/Outreach Messages - Wilken Enterprises.docx
@@ -71,7 +71,7 @@
     <w:p>
       <w:r>
         <w:rPr/>
-        <w:t xml:space="preserve">The range covers HVAC and indoor air quality (pleated, panel, pocket and HEPA filters), dust collection (collector bags, pleated bags and cartridges, including OEM replacements), liquid filtration (bag and cartridge filters, and roll media with FDA-approved options), hydraulic and compressed air filters, air-oil separators, and absorbents and spill control (pads, rolls, spill kits, drain covers, berms and spill pallets). Many lines come in standard and custom sizes.</w:t>
+        <w:t xml:space="preserve">The range covers HVAC and indoor air quality (pleated, panel, pocket and HEPA filters), diffusion and exhaust media for finishing lines, dust collection (collector bags, pleated bags and cartridges, including OEM replacements in oval designs), liquid and process filtration (bag and cartridge filters, and roll media with FDA-approved options), hydraulic, oil and compressed air filters, air-oil separators, water filters, and absorbents and spill control (oil-only, universal and HazMat pads and rolls, spill kits with refills, drain covers, berms and spill pallets). Many lines come in standard and custom sizes.</w:t>
       </w:r>
     </w:p>
     <w:p>
@@ -98,7 +98,7 @@
     <w:p>
       <w:r>
         <w:rPr/>
-        <w:t xml:space="preserve">Kaity shared the product types, job titles and industries. Filters are used almost everywhere, so the list is wide. To keep each message relevant to everyone who receives it, we group the industries into four ICPs. All four start in Indiana, then expand to the surrounding states: Illinois, Ohio, Michigan and Kentucky.</w:t>
+        <w:t xml:space="preserve">Kaity shared the product types, job titles and industries. HVAC filters are used almost everywhere, so the list is wide and can stay flexible. To keep each message relevant to everyone who receives it, we group the industries into four ICPs. All four start in Indiana, then expand to the surrounding states: Illinois, Ohio, Michigan and Kentucky.</w:t>
       </w:r>
     </w:p>
     <w:tbl>
@@ -2104,7 +2104,7 @@
           <w:i w:val="1"/>
           <w:iCs w:val="1"/>
         </w:rPr>
-        <w:t xml:space="preserve">We also cover absorbents and spill control, from pads and rolls to ready-to-use spill kits with refills.</w:t>
+        <w:t xml:space="preserve">We also cover absorbents and spill control, from pads and rolls to ready-response spill kits with easy-to-replace refills.</w:t>
       </w:r>
     </w:p>
     <w:p>
@@ -2393,7 +2393,7 @@
       </w:r>
       <w:r>
         <w:rPr/>
-        <w:t xml:space="preserve"> Wilken was acquired by Steiner Enterprises, which will have its own outreach document. As Kaity put it: “We absolutely can use Wilken as a way in for Steiner. By reliably supplying Wilken customers with filters and absorbent materials, we have already had many customers ask us, 'Hey, can you help us with this too?' in regard to products that aren't related to filters at all – and that's our 'in' for Steiner.” So any reply about non-filter products is passed on to the client.</w:t>
+        <w:t xml:space="preserve"> Wilken was acquired by Steiner Enterprises, which will have its own outreach document. As Tom mentioned on the call, and Kaity wrote: “We absolutely can use Wilken as a way in for Steiner. By reliably supplying Wilken customers with filters and absorbent materials, we have already had many customers ask us, 'Hey, can you help us with this too?' in regard to products that aren't related to filters at all – and that's our 'in' for Steiner.” So any reply about non-filter products is passed on to the client.</w:t>
       </w:r>
     </w:p>
     <w:p>
@@ -2414,7 +2414,7 @@
       </w:r>
       <w:r>
         <w:rPr/>
-        <w:t xml:space="preserve"> the 51-1,000 employee range is our suggestion. We can widen it if the first searches return too few leads in Indiana.</w:t>
+        <w:t xml:space="preserve"> the 51-1,000 employee range is our suggestion. We can widen it if the first searches return too few leads in Indiana. If the list is too big instead, Kaity suggested starting with one industry type, for example metal fabrication &amp; machining.</w:t>
       </w:r>
     </w:p>
     <w:p>

</xml_diff>

<commit_message>
Add a plant leadership track to the Wilken messages
Plant, operations and director-level titles get their own duality and
empathy messages about uptime and equipment life, instead of the
maintenance messages.

Co-Authored-By: Claude Opus 5.5 <noreply@anthropic.com>
Claude-Session: https://claude.ai/code/session_018AsKRCDgw5Ln2FqTPH9DBq
</commit_message>
<xml_diff>
--- a/Outreach Messages - Wilken Enterprises.docx
+++ b/Outreach Messages - Wilken Enterprises.docx
@@ -518,7 +518,7 @@
     <w:p>
       <w:r>
         <w:rPr/>
-        <w:t xml:space="preserve">Within each plant, we reach out to a few people where available, split into two tracks so the messages match their day-to-day work:</w:t>
+        <w:t xml:space="preserve">Within each plant, we reach out to a few people where available, split into three tracks so the messages match their day-to-day work:</w:t>
       </w:r>
     </w:p>
     <w:p>
@@ -535,11 +535,11 @@
           <w:b w:val="1"/>
           <w:bCs w:val="1"/>
         </w:rPr>
-        <w:t xml:space="preserve">Plant track:</w:t>
-      </w:r>
-      <w:r>
-        <w:rPr/>
-        <w:t xml:space="preserve"> Maintenance Manager, Reliability Manager, Facilities Manager, HVAC Manager, Plant Manager, Plant Engineer, Process Engineer, Operations Manager, Director of Operations. They use the filters and know when something goes wrong.</w:t>
+        <w:t xml:space="preserve">Maintenance track:</w:t>
+      </w:r>
+      <w:r>
+        <w:rPr/>
+        <w:t xml:space="preserve"> Maintenance Manager, Reliability Manager, Facilities Manager, HVAC Manager, Plant Engineer, Process Engineer. They pick and change the filters, and know when something goes wrong.</w:t>
       </w:r>
     </w:p>
     <w:p>
@@ -556,26 +556,11 @@
           <w:b w:val="1"/>
           <w:bCs w:val="1"/>
         </w:rPr>
-        <w:t xml:space="preserve">Purchasing track:</w:t>
-      </w:r>
-      <w:r>
-        <w:rPr/>
-        <w:t xml:space="preserve"> Purchasing Manager, Procurement Manager, Supply Chain Manager. They place the orders and pick the suppliers.</w:t>
-      </w:r>
-    </w:p>
-    <w:p>
-      <w:pPr>
-        <w:pStyle w:val="Heading3"/>
-      </w:pPr>
-      <w:r>
-        <w:rPr/>
-        <w:t xml:space="preserve">Sales Navigator search for ICP 1</w:t>
-      </w:r>
-    </w:p>
-    <w:p>
-      <w:r>
-        <w:rPr/>
-        <w:t xml:space="preserve">We build two saved searches, one per track, with the same account filters:</w:t>
+        <w:t xml:space="preserve">Plant leadership track:</w:t>
+      </w:r>
+      <w:r>
+        <w:rPr/>
+        <w:t xml:space="preserve"> Plant Manager, Operations Manager, Director of Operations. They care about uptime, equipment life and cost, and can point us to the right person.</w:t>
       </w:r>
     </w:p>
     <w:p>
@@ -592,11 +577,26 @@
           <w:b w:val="1"/>
           <w:bCs w:val="1"/>
         </w:rPr>
-        <w:t xml:space="preserve">Geography (lead filter):</w:t>
-      </w:r>
-      <w:r>
-        <w:rPr/>
-        <w:t xml:space="preserve"> Indiana, United States. We filter on where the person works, not on company headquarters, because many Indiana plants belong to companies based in other states.</w:t>
+        <w:t xml:space="preserve">Purchasing track:</w:t>
+      </w:r>
+      <w:r>
+        <w:rPr/>
+        <w:t xml:space="preserve"> Purchasing Manager, Procurement Manager, Supply Chain Manager. They place the orders and pick the suppliers.</w:t>
+      </w:r>
+    </w:p>
+    <w:p>
+      <w:pPr>
+        <w:pStyle w:val="Heading3"/>
+      </w:pPr>
+      <w:r>
+        <w:rPr/>
+        <w:t xml:space="preserve">Sales Navigator search for ICP 1</w:t>
+      </w:r>
+    </w:p>
+    <w:p>
+      <w:r>
+        <w:rPr/>
+        <w:t xml:space="preserve">We build three saved searches, one per track, with the same account filters:</w:t>
       </w:r>
     </w:p>
     <w:p>
@@ -613,11 +613,11 @@
           <w:b w:val="1"/>
           <w:bCs w:val="1"/>
         </w:rPr>
-        <w:t xml:space="preserve">Industry (account filter):</w:t>
-      </w:r>
-      <w:r>
-        <w:rPr/>
-        <w:t xml:space="preserve"> Motor Vehicle Manufacturing, Motor Vehicle Parts Manufacturing, Transportation Equipment Manufacturing, Industrial Machinery Manufacturing, Machinery Manufacturing, Fabricated Metal Products, Primary Metal Manufacturing, Chemical Manufacturing, Paint, Coating, and Adhesive Manufacturing, Plastics Manufacturing, Rubber Products Manufacturing, Paper and Forest Product Manufacturing, Packaging and Containers Manufacturing, Printing Services, Semiconductor Manufacturing, Appliances, Electrical, and Electronics Manufacturing.</w:t>
+        <w:t xml:space="preserve">Geography (lead filter):</w:t>
+      </w:r>
+      <w:r>
+        <w:rPr/>
+        <w:t xml:space="preserve"> Indiana, United States. We filter on where the person works, not on company headquarters, because many Indiana plants belong to companies based in other states.</w:t>
       </w:r>
     </w:p>
     <w:p>
@@ -634,11 +634,11 @@
           <w:b w:val="1"/>
           <w:bCs w:val="1"/>
         </w:rPr>
-        <w:t xml:space="preserve">Company headcount (account filter):</w:t>
-      </w:r>
-      <w:r>
-        <w:rPr/>
-        <w:t xml:space="preserve"> 51-200, 201-500 and 501-1,000. Big enough to have a maintenance team and regular filter orders, small enough that the plant still picks its own suppliers. This is our suggestion, to confirm with the client.</w:t>
+        <w:t xml:space="preserve">Industry (account filter):</w:t>
+      </w:r>
+      <w:r>
+        <w:rPr/>
+        <w:t xml:space="preserve"> Motor Vehicle Manufacturing, Motor Vehicle Parts Manufacturing, Transportation Equipment Manufacturing, Industrial Machinery Manufacturing, Machinery Manufacturing, Fabricated Metal Products, Primary Metal Manufacturing, Chemical Manufacturing, Paint, Coating, and Adhesive Manufacturing, Plastics Manufacturing, Rubber Products Manufacturing, Paper and Forest Product Manufacturing, Packaging and Containers Manufacturing, Printing Services, Semiconductor Manufacturing, Appliances, Electrical, and Electronics Manufacturing.</w:t>
       </w:r>
     </w:p>
     <w:p>
@@ -655,11 +655,11 @@
           <w:b w:val="1"/>
           <w:bCs w:val="1"/>
         </w:rPr>
-        <w:t xml:space="preserve">Current job title, plant track:</w:t>
-      </w:r>
-      <w:r>
-        <w:rPr/>
-        <w:t xml:space="preserve"> "maintenance manager" OR "reliability manager" OR "facilities manager" OR "HVAC manager" OR "plant manager" OR "plant engineer" OR "process engineer" OR "operations manager" OR "director of operations"</w:t>
+        <w:t xml:space="preserve">Company headcount (account filter):</w:t>
+      </w:r>
+      <w:r>
+        <w:rPr/>
+        <w:t xml:space="preserve"> 51-200, 201-500 and 501-1,000. Big enough to have a maintenance team and regular filter orders, small enough that the plant still picks its own suppliers. This is our suggestion, to confirm with the client.</w:t>
       </w:r>
     </w:p>
     <w:p>
@@ -676,11 +676,11 @@
           <w:b w:val="1"/>
           <w:bCs w:val="1"/>
         </w:rPr>
-        <w:t xml:space="preserve">Current job title, purchasing track:</w:t>
-      </w:r>
-      <w:r>
-        <w:rPr/>
-        <w:t xml:space="preserve"> "purchasing manager" OR "procurement manager" OR "supply chain manager"</w:t>
+        <w:t xml:space="preserve">Current job title, maintenance track:</w:t>
+      </w:r>
+      <w:r>
+        <w:rPr/>
+        <w:t xml:space="preserve"> "maintenance manager" OR "reliability manager" OR "facilities manager" OR "HVAC manager" OR "plant engineer" OR "process engineer"</w:t>
       </w:r>
     </w:p>
     <w:p>
@@ -697,53 +697,11 @@
           <w:b w:val="1"/>
           <w:bCs w:val="1"/>
         </w:rPr>
-        <w:t xml:space="preserve">Exclude:</w:t>
-      </w:r>
-      <w:r>
-        <w:rPr/>
-        <w:t xml:space="preserve"> current Wilken customers (uploaded as an account list), other filter distributors, and titles containing sales, intern or assistant.</w:t>
-      </w:r>
-    </w:p>
-    <w:p>
-      <w:pPr>
-        <w:spacing w:before="60" w:after="120"/>
-      </w:pPr>
-      <w:r>
-        <w:rPr>
-          <w:i w:val="1"/>
-          <w:iCs w:val="1"/>
-          <w:color w:val="404040"/>
-          <w:sz w:val="22"/>
-          <w:szCs w:val="22"/>
-        </w:rPr>
-        <w:t xml:space="preserve">Next ICPs use the same title and geography filters. ICP 2 adds Food and Beverage Manufacturing, Pharmaceutical Manufacturing and Medical Equipment Manufacturing. ICP 3 uses Hospitals and Health Care, Higher Education, Facilities Services and Warehousing and Storage. ICP 4 uses Utilities, Water Supply and Irrigation Systems, Waste Treatment and Disposal, and Farming. Industry names can differ slightly in Sales Navigator, so pick the closest match when building the search.</w:t>
-      </w:r>
-    </w:p>
-    <w:p>
-      <w:pPr>
-        <w:pStyle w:val="Heading2"/>
-      </w:pPr>
-      <w:r>
-        <w:rPr/>
-        <w:t xml:space="preserve">The Strategy</w:t>
-      </w:r>
-    </w:p>
-    <w:p>
-      <w:r>
-        <w:rPr/>
-        <w:t xml:space="preserve">We send connection requests from Matt's profile, followed by four LinkedIn messages. Each message comes from a different angle, so if one doesn't land, the next one might. After four, we stop: more messages annoy people rather than convince them.</w:t>
-      </w:r>
-    </w:p>
-    <w:p>
-      <w:r>
-        <w:rPr/>
-        <w:t xml:space="preserve">The first follow-up goes out one day after the invitation is accepted, so it doesn't feel automated. The rest are spaced a few days apart. Prospects who don't accept the invitation, or accept but don't reply, receive three emails, starting one week after the last LinkedIn message (or one week after the invitation).</w:t>
-      </w:r>
-    </w:p>
-    <w:p>
-      <w:r>
-        <w:rPr/>
-        <w:t xml:space="preserve">We test two versions side by side, each on half of the leads:</w:t>
+        <w:t xml:space="preserve">Current job title, plant leadership track:</w:t>
+      </w:r>
+      <w:r>
+        <w:rPr/>
+        <w:t xml:space="preserve"> "plant manager" OR "operations manager" OR "director of operations"</w:t>
       </w:r>
     </w:p>
     <w:p>
@@ -760,11 +718,11 @@
           <w:b w:val="1"/>
           <w:bCs w:val="1"/>
         </w:rPr>
-        <w:t xml:space="preserve">BizzBee version:</w:t>
-      </w:r>
-      <w:r>
-        <w:rPr/>
-        <w:t xml:space="preserve"> built on the Sweet Leads framework. Duality, empathy, credibility, then free value. It starts a conversation first and talks about Wilken later.</w:t>
+        <w:t xml:space="preserve">Current job title, purchasing track:</w:t>
+      </w:r>
+      <w:r>
+        <w:rPr/>
+        <w:t xml:space="preserve"> "purchasing manager" OR "procurement manager" OR "supply chain manager"</w:t>
       </w:r>
     </w:p>
     <w:p>
@@ -781,6 +739,90 @@
           <w:b w:val="1"/>
           <w:bCs w:val="1"/>
         </w:rPr>
+        <w:t xml:space="preserve">Exclude:</w:t>
+      </w:r>
+      <w:r>
+        <w:rPr/>
+        <w:t xml:space="preserve"> current Wilken customers (uploaded as an account list), other filter distributors, and titles containing sales, intern or assistant.</w:t>
+      </w:r>
+    </w:p>
+    <w:p>
+      <w:pPr>
+        <w:spacing w:before="60" w:after="120"/>
+      </w:pPr>
+      <w:r>
+        <w:rPr>
+          <w:i w:val="1"/>
+          <w:iCs w:val="1"/>
+          <w:color w:val="404040"/>
+          <w:sz w:val="22"/>
+          <w:szCs w:val="22"/>
+        </w:rPr>
+        <w:t xml:space="preserve">Next ICPs use the same title and geography filters. ICP 2 adds Food and Beverage Manufacturing, Pharmaceutical Manufacturing and Medical Equipment Manufacturing. ICP 3 uses Hospitals and Health Care, Higher Education, Facilities Services and Warehousing and Storage. ICP 4 uses Utilities, Water Supply and Irrigation Systems, Waste Treatment and Disposal, and Farming. Industry names can differ slightly in Sales Navigator, so pick the closest match when building the search.</w:t>
+      </w:r>
+    </w:p>
+    <w:p>
+      <w:pPr>
+        <w:pStyle w:val="Heading2"/>
+      </w:pPr>
+      <w:r>
+        <w:rPr/>
+        <w:t xml:space="preserve">The Strategy</w:t>
+      </w:r>
+    </w:p>
+    <w:p>
+      <w:r>
+        <w:rPr/>
+        <w:t xml:space="preserve">We send connection requests from Matt's profile, followed by four LinkedIn messages. Each message comes from a different angle, so if one doesn't land, the next one might. After four, we stop: more messages annoy people rather than convince them.</w:t>
+      </w:r>
+    </w:p>
+    <w:p>
+      <w:r>
+        <w:rPr/>
+        <w:t xml:space="preserve">The first follow-up goes out one day after the invitation is accepted, so it doesn't feel automated. The rest are spaced a few days apart. Prospects who don't accept the invitation, or accept but don't reply, receive three emails, starting one week after the last LinkedIn message (or one week after the invitation).</w:t>
+      </w:r>
+    </w:p>
+    <w:p>
+      <w:r>
+        <w:rPr/>
+        <w:t xml:space="preserve">We test two versions side by side, each on half of the leads:</w:t>
+      </w:r>
+    </w:p>
+    <w:p>
+      <w:pPr>
+        <w:numPr>
+          <w:ilvl w:val="0"/>
+          <w:numId w:val="2"/>
+        </w:numPr>
+        <w:spacing w:after="0" w:before="120" w:lineRule="auto"/>
+        <w:ind w:left="720" w:hanging="360"/>
+      </w:pPr>
+      <w:r>
+        <w:rPr>
+          <w:b w:val="1"/>
+          <w:bCs w:val="1"/>
+        </w:rPr>
+        <w:t xml:space="preserve">BizzBee version:</w:t>
+      </w:r>
+      <w:r>
+        <w:rPr/>
+        <w:t xml:space="preserve"> built on the Sweet Leads framework. Duality, empathy, credibility, then free value. It starts a conversation first and talks about Wilken later.</w:t>
+      </w:r>
+    </w:p>
+    <w:p>
+      <w:pPr>
+        <w:numPr>
+          <w:ilvl w:val="0"/>
+          <w:numId w:val="2"/>
+        </w:numPr>
+        <w:spacing w:after="0" w:before="120" w:lineRule="auto"/>
+        <w:ind w:left="720" w:hanging="360"/>
+      </w:pPr>
+      <w:r>
+        <w:rPr>
+          <w:b w:val="1"/>
+          <w:bCs w:val="1"/>
+        </w:rPr>
         <w:t xml:space="preserve">Direct version:</w:t>
       </w:r>
       <w:r>
@@ -1050,7 +1092,7 @@
           <w:iCs w:val="1"/>
           <w:color w:val="1F497D"/>
         </w:rPr>
-        <w:t xml:space="preserve">Plant track</w:t>
+        <w:t xml:space="preserve">Maintenance track</w:t>
       </w:r>
     </w:p>
     <w:p>
@@ -1150,7 +1192,57 @@
           <w:iCs w:val="1"/>
           <w:color w:val="1F497D"/>
         </w:rPr>
-        <w:t xml:space="preserve">Direct version (both tracks)</w:t>
+        <w:t xml:space="preserve">Plant leadership track</w:t>
+      </w:r>
+    </w:p>
+    <w:p>
+      <w:pPr>
+        <w:pBdr>
+          <w:top w:color="4f81bd" w:space="10" w:sz="4" w:val="single"/>
+          <w:bottom w:color="4f81bd" w:space="10" w:sz="4" w:val="single"/>
+        </w:pBdr>
+        <w:spacing w:after="240" w:before="240" w:line="240" w:lineRule="auto"/>
+        <w:ind w:left="720"/>
+        <w:jc w:val="left"/>
+      </w:pPr>
+      <w:r>
+        <w:rPr>
+          <w:i w:val="1"/>
+          <w:iCs w:val="1"/>
+        </w:rPr>
+        <w:t xml:space="preserve">Thanks for connecting, </w:t>
+      </w:r>
+      <w:r>
+        <w:rPr>
+          <w:b w:val="1"/>
+          <w:bCs w:val="1"/>
+          <w:i w:val="1"/>
+          <w:iCs w:val="1"/>
+          <w:color w:val="FF9900"/>
+        </w:rPr>
+        <w:t xml:space="preserve">[First Name]</w:t>
+      </w:r>
+      <w:r>
+        <w:rPr>
+          <w:i w:val="1"/>
+          <w:iCs w:val="1"/>
+        </w:rPr>
+        <w:t xml:space="preserve">. Curious what you think. Some plant leaders see filters and absorbents as a small line item that maintenance takes care of. Others see them as an uptime question, because the wrong filter, or a missing one, can hold up a line. Where do you land?</w:t>
+      </w:r>
+    </w:p>
+    <w:p>
+      <w:pPr>
+        <w:spacing w:before="240" w:after="0"/>
+      </w:pPr>
+      <w:r>
+        <w:rPr>
+          <w:b w:val="1"/>
+          <w:bCs w:val="1"/>
+          <w:i w:val="1"/>
+          <w:iCs w:val="1"/>
+          <w:color w:val="1F497D"/>
+        </w:rPr>
+        <w:t xml:space="preserve">Direct version (all tracks)</w:t>
       </w:r>
     </w:p>
     <w:p>
@@ -1217,7 +1309,7 @@
           <w:sz w:val="22"/>
           <w:szCs w:val="22"/>
         </w:rPr>
-        <w:t xml:space="preserve">Response suggestion: whatever side they pick, ask why, or how it works at their plant. Don't pitch yet. If they mention a filter that's hard to get or often late, ask what they use it for. That's the opening for the next message. In the Direct version, if they point to someone else, thank them and connect with that person.</w:t>
+        <w:t xml:space="preserve">Response suggestion: whatever side they pick, ask why, or how it works at their plant. Don't pitch yet. If they mention a filter that's hard to get or often late, ask what they use it for. That's the opening for the next message. With plant leaders, also ask who handles filters day to day, and connect with that person. In the Direct version, if they point to someone else, thank them and connect with that person.</w:t>
       </w:r>
     </w:p>
     <w:p>
@@ -1257,7 +1349,7 @@
           <w:iCs w:val="1"/>
           <w:color w:val="1F497D"/>
         </w:rPr>
-        <w:t xml:space="preserve">Plant track</w:t>
+        <w:t xml:space="preserve">Maintenance track</w:t>
       </w:r>
     </w:p>
     <w:p>
@@ -1357,7 +1449,57 @@
           <w:iCs w:val="1"/>
           <w:color w:val="1F497D"/>
         </w:rPr>
-        <w:t xml:space="preserve">Direct version (both tracks)</w:t>
+        <w:t xml:space="preserve">Plant leadership track</w:t>
+      </w:r>
+    </w:p>
+    <w:p>
+      <w:pPr>
+        <w:pBdr>
+          <w:top w:color="4f81bd" w:space="10" w:sz="4" w:val="single"/>
+          <w:bottom w:color="4f81bd" w:space="10" w:sz="4" w:val="single"/>
+        </w:pBdr>
+        <w:spacing w:after="240" w:before="240" w:line="240" w:lineRule="auto"/>
+        <w:ind w:left="720"/>
+        <w:jc w:val="left"/>
+      </w:pPr>
+      <w:r>
+        <w:rPr>
+          <w:i w:val="1"/>
+          <w:iCs w:val="1"/>
+        </w:rPr>
+        <w:t xml:space="preserve">I had a thought, </w:t>
+      </w:r>
+      <w:r>
+        <w:rPr>
+          <w:b w:val="1"/>
+          <w:bCs w:val="1"/>
+          <w:i w:val="1"/>
+          <w:iCs w:val="1"/>
+          <w:color w:val="FF9900"/>
+        </w:rPr>
+        <w:t xml:space="preserve">[First Name]</w:t>
+      </w:r>
+      <w:r>
+        <w:rPr>
+          <w:i w:val="1"/>
+          <w:iCs w:val="1"/>
+        </w:rPr>
+        <w:t xml:space="preserve">. The right filters do more than keep air and fluids clean. Good hydraulic filters, for example, mean less maintenance and longer equipment life. But when filters come from several suppliers, it's hard to see what the plant spends on them and what it gets back. How do you keep track of it?</w:t>
+      </w:r>
+    </w:p>
+    <w:p>
+      <w:pPr>
+        <w:spacing w:before="240" w:after="0"/>
+      </w:pPr>
+      <w:r>
+        <w:rPr>
+          <w:b w:val="1"/>
+          <w:bCs w:val="1"/>
+          <w:i w:val="1"/>
+          <w:iCs w:val="1"/>
+          <w:color w:val="1F497D"/>
+        </w:rPr>
+        <w:t xml:space="preserve">Direct version (all tracks)</w:t>
       </w:r>
     </w:p>
     <w:p>
@@ -1447,7 +1589,7 @@
           <w:iCs w:val="1"/>
           <w:color w:val="1F497D"/>
         </w:rPr>
-        <w:t xml:space="preserve">BizzBee version (both tracks)</w:t>
+        <w:t xml:space="preserve">BizzBee version (all tracks)</w:t>
       </w:r>
     </w:p>
     <w:p>
@@ -1497,7 +1639,7 @@
           <w:iCs w:val="1"/>
           <w:color w:val="1F497D"/>
         </w:rPr>
-        <w:t xml:space="preserve">Direct version (both tracks)</w:t>
+        <w:t xml:space="preserve">Direct version (all tracks)</w:t>
       </w:r>
     </w:p>
     <w:p>
@@ -1604,7 +1746,7 @@
           <w:iCs w:val="1"/>
           <w:color w:val="1F497D"/>
         </w:rPr>
-        <w:t xml:space="preserve">Both tracks, both versions</w:t>
+        <w:t xml:space="preserve">All tracks, both versions</w:t>
       </w:r>
     </w:p>
     <w:p>
@@ -1669,7 +1811,7 @@
     <w:p>
       <w:r>
         <w:rPr/>
-        <w:t xml:space="preserve">Emails go to prospects who didn't accept the invitation, or accepted but didn't reply. One version works for both tracks: the last line of each email lets the reader point us to the right person. Subject lines are short and lowercase, with two options per email so we can test them.</w:t>
+        <w:t xml:space="preserve">Emails go to prospects who didn't accept the invitation, or accepted but didn't reply. One version works for all tracks: the last line of each email lets the reader point us to the right person. Subject lines are short and lowercase, with two options per email so we can test them.</w:t>
       </w:r>
     </w:p>
     <w:p>

</xml_diff>